<commit_message>
Snapshot: composition and arrangement updates
Made-with: Cursor
</commit_message>
<xml_diff>
--- a/docs/composition_engine_reference.docx
+++ b/docs/composition_engine_reference.docx
@@ -2,7 +2,7 @@
 <file path=word/document.xml><?xml version="1.0" encoding="utf-8"?>
 <w:document xmlns:w="http://schemas.openxmlformats.org/wordprocessingml/2006/main" xmlns:m="http://schemas.openxmlformats.org/officeDocument/2006/math" xmlns:r="http://schemas.openxmlformats.org/officeDocument/2006/relationships" xmlns:o="urn:schemas-microsoft-com:office:office" xmlns:v="urn:schemas-microsoft-com:vml" xmlns:w10="urn:schemas-microsoft-com:office:word" xmlns:a="http://schemas.openxmlformats.org/drawingml/2006/main" xmlns:pic="http://schemas.openxmlformats.org/drawingml/2006/picture" xmlns:wp="http://schemas.openxmlformats.org/drawingml/2006/wordprocessingDrawing">
   <w:body>
-    <w:bookmarkStart w:id="25" w:name="composition-engine-reference-manual"/>
+    <w:bookmarkStart w:id="28" w:name="composition-engine-reference-manual"/>
     <w:p>
       <w:pPr>
         <w:pStyle w:val="Heading1"/>
@@ -173,7 +173,41 @@
           <w:numId w:val="1001"/>
         </w:numPr>
       </w:pPr>
-      <w:hyperlink w:anchor="X82e2874fdc1e3f88328db0f699331cb9754dd09">
+      <w:hyperlink w:anchor="Xfa8b5cc60faa650190ae7976d4968413e8042b9">
+        <w:r>
+          <w:rPr>
+            <w:rStyle w:val="Hyperlink"/>
+          </w:rPr>
+          <w:t xml:space="preserve">Wheeler Lyric Engine</w:t>
+        </w:r>
+      </w:hyperlink>
+    </w:p>
+    <w:p>
+      <w:pPr>
+        <w:pStyle w:val="Compact"/>
+        <w:numPr>
+          <w:ilvl w:val="0"/>
+          <w:numId w:val="1001"/>
+        </w:numPr>
+      </w:pPr>
+      <w:hyperlink w:anchor="Xfc12a79cb3af2d9cffe591b03c24715b686fdf9">
+        <w:r>
+          <w:rPr>
+            <w:rStyle w:val="Hyperlink"/>
+          </w:rPr>
+          <w:t xml:space="preserve">Stravinsky Chamber Pulse Engine</w:t>
+        </w:r>
+      </w:hyperlink>
+    </w:p>
+    <w:p>
+      <w:pPr>
+        <w:pStyle w:val="Compact"/>
+        <w:numPr>
+          <w:ilvl w:val="0"/>
+          <w:numId w:val="1001"/>
+        </w:numPr>
+      </w:pPr>
+      <w:hyperlink w:anchor="X68d3a0014bc7038178231e44e7b42baa570f6f5">
         <w:r>
           <w:rPr>
             <w:rStyle w:val="Hyperlink"/>
@@ -190,7 +224,7 @@
           <w:numId w:val="1001"/>
         </w:numPr>
       </w:pPr>
-      <w:hyperlink w:anchor="Xdc7a425917c24547727f1827ac657a66b8aeab9">
+      <w:hyperlink w:anchor="Xe9eab4d7779354e447f266331d89a27b5a12724">
         <w:r>
           <w:rPr>
             <w:rStyle w:val="Hyperlink"/>
@@ -207,7 +241,7 @@
           <w:numId w:val="1001"/>
         </w:numPr>
       </w:pPr>
-      <w:hyperlink w:anchor="X8cc0b8987679de7f04d86340489a446af3bb473">
+      <w:hyperlink w:anchor="Xabc1e1b65710c469616e1daccf4d576ff9d57c0">
         <w:r>
           <w:rPr>
             <w:rStyle w:val="Hyperlink"/>
@@ -224,7 +258,7 @@
           <w:numId w:val="1001"/>
         </w:numPr>
       </w:pPr>
-      <w:hyperlink w:anchor="X3956c71f968c52a7dd7bb32ea948aa433aedb79">
+      <w:hyperlink w:anchor="Xe016cc503ec27281cdc87a4ffd991dbf524a95d">
         <w:r>
           <w:rPr>
             <w:rStyle w:val="Hyperlink"/>
@@ -241,7 +275,7 @@
           <w:numId w:val="1001"/>
         </w:numPr>
       </w:pPr>
-      <w:hyperlink w:anchor="Xbdb15792c25560fdbbc6f53b45bf21b0c6eb50b">
+      <w:hyperlink w:anchor="Xe44c492a4bb0c2c6d7987ae33f441d080101970">
         <w:r>
           <w:rPr>
             <w:rStyle w:val="Hyperlink"/>
@@ -258,7 +292,7 @@
           <w:numId w:val="1001"/>
         </w:numPr>
       </w:pPr>
-      <w:hyperlink w:anchor="X06c611b42873f9f0060dbda3fe012a876441e0b">
+      <w:hyperlink w:anchor="X013a6a8b28a63eed74512c1df081985e3a0b9ea">
         <w:r>
           <w:rPr>
             <w:rStyle w:val="Hyperlink"/>
@@ -275,7 +309,7 @@
           <w:numId w:val="1001"/>
         </w:numPr>
       </w:pPr>
-      <w:hyperlink w:anchor="X9296fc30666070956a98d84a5f8360cbb33c639">
+      <w:hyperlink w:anchor="X9fc9e18907302bb2e72f8b7c51ce816c9e8eb5a">
         <w:r>
           <w:rPr>
             <w:rStyle w:val="Hyperlink"/>
@@ -292,7 +326,7 @@
           <w:numId w:val="1001"/>
         </w:numPr>
       </w:pPr>
-      <w:hyperlink w:anchor="X8df3956cb91ad84ce89d69cce58d7c8d3557a65">
+      <w:hyperlink w:anchor="Xe5abc6ebaa5b17576d8efb8f65d390bf65e40bb">
         <w:r>
           <w:rPr>
             <w:rStyle w:val="Hyperlink"/>
@@ -400,17 +434,17 @@
         <w:pStyle w:val="FirstParagraph"/>
       </w:pPr>
       <w:r>
-        <w:t xml:space="preserve">The system is built around</w:t>
-      </w:r>
-      <w:r>
-        <w:t xml:space="preserve"> </w:t>
-      </w:r>
-      <w:r>
-        <w:rPr>
-          <w:b/>
-          <w:bCs/>
-        </w:rPr>
-        <w:t xml:space="preserve">four primary engines</w:t>
+        <w:t xml:space="preserve">The system is built around a</w:t>
+      </w:r>
+      <w:r>
+        <w:t xml:space="preserve"> </w:t>
+      </w:r>
+      <w:r>
+        <w:rPr>
+          <w:b/>
+          <w:bCs/>
+        </w:rPr>
+        <w:t xml:space="preserve">master engine palette</w:t>
       </w:r>
       <w:r>
         <w:t xml:space="preserve">:</w:t>
@@ -466,18 +500,18 @@
                 <w:b/>
                 <w:bCs/>
               </w:rPr>
-              <w:t xml:space="preserve">Frisell Atmosphere</w:t>
-            </w:r>
-          </w:p>
-        </w:tc>
-        <w:tc>
-          <w:tcPr/>
-          <w:p>
-            <w:pPr>
-              <w:pStyle w:val="Compact"/>
-            </w:pPr>
-            <w:r>
-              <w:t xml:space="preserve">Spacious, lyrical, ECM ambience</w:t>
+              <w:t xml:space="preserve">Scofield–Holland Groove</w:t>
+            </w:r>
+          </w:p>
+        </w:tc>
+        <w:tc>
+          <w:tcPr/>
+          <w:p>
+            <w:pPr>
+              <w:pStyle w:val="Compact"/>
+            </w:pPr>
+            <w:r>
+              <w:t xml:space="preserve">Syncopated, bass-driven, medium tempo</w:t>
             </w:r>
           </w:p>
         </w:tc>
@@ -522,18 +556,18 @@
                 <w:b/>
                 <w:bCs/>
               </w:rPr>
-              <w:t xml:space="preserve">Scofield–Holland Groove</w:t>
-            </w:r>
-          </w:p>
-        </w:tc>
-        <w:tc>
-          <w:tcPr/>
-          <w:p>
-            <w:pPr>
-              <w:pStyle w:val="Compact"/>
-            </w:pPr>
-            <w:r>
-              <w:t xml:space="preserve">Syncopated, bass-driven, medium tempo</w:t>
+              <w:t xml:space="preserve">Frisell Atmosphere</w:t>
+            </w:r>
+          </w:p>
+        </w:tc>
+        <w:tc>
+          <w:tcPr/>
+          <w:p>
+            <w:pPr>
+              <w:pStyle w:val="Compact"/>
+            </w:pPr>
+            <w:r>
+              <w:t xml:space="preserve">Spacious, lyrical, ECM ambience</w:t>
             </w:r>
           </w:p>
         </w:tc>
@@ -566,6 +600,174 @@
           </w:p>
         </w:tc>
       </w:tr>
+      <w:tr>
+        <w:tc>
+          <w:tcPr/>
+          <w:p>
+            <w:pPr>
+              <w:pStyle w:val="Compact"/>
+            </w:pPr>
+            <w:r>
+              <w:rPr>
+                <w:b/>
+                <w:bCs/>
+              </w:rPr>
+              <w:t xml:space="preserve">Wheeler Lyric</w:t>
+            </w:r>
+          </w:p>
+        </w:tc>
+        <w:tc>
+          <w:tcPr/>
+          <w:p>
+            <w:pPr>
+              <w:pStyle w:val="Compact"/>
+            </w:pPr>
+            <w:r>
+              <w:t xml:space="preserve">Luminous ECM lyricism, floating harmony</w:t>
+            </w:r>
+          </w:p>
+        </w:tc>
+      </w:tr>
+      <w:tr>
+        <w:tc>
+          <w:tcPr/>
+          <w:p>
+            <w:pPr>
+              <w:pStyle w:val="Compact"/>
+            </w:pPr>
+            <w:r>
+              <w:rPr>
+                <w:b/>
+                <w:bCs/>
+              </w:rPr>
+              <w:t xml:space="preserve">Stravinsky Chamber Pulse</w:t>
+            </w:r>
+          </w:p>
+        </w:tc>
+        <w:tc>
+          <w:tcPr/>
+          <w:p>
+            <w:pPr>
+              <w:pStyle w:val="Compact"/>
+            </w:pPr>
+            <w:r>
+              <w:t xml:space="preserve">Rhythmic cells, shifting meters, ensemble gestures</w:t>
+            </w:r>
+          </w:p>
+        </w:tc>
+      </w:tr>
+      <w:tr>
+        <w:tc>
+          <w:tcPr/>
+          <w:p>
+            <w:pPr>
+              <w:pStyle w:val="Compact"/>
+            </w:pPr>
+            <w:r>
+              <w:rPr>
+                <w:b/>
+                <w:bCs/>
+              </w:rPr>
+              <w:t xml:space="preserve">Zappa Disruption</w:t>
+            </w:r>
+          </w:p>
+        </w:tc>
+        <w:tc>
+          <w:tcPr/>
+          <w:p>
+            <w:pPr>
+              <w:pStyle w:val="Compact"/>
+            </w:pPr>
+            <w:r>
+              <w:t xml:space="preserve">Secondary only — ensemble hits, rhythmic fractures</w:t>
+            </w:r>
+          </w:p>
+        </w:tc>
+      </w:tr>
+      <w:tr>
+        <w:tc>
+          <w:tcPr/>
+          <w:p>
+            <w:pPr>
+              <w:pStyle w:val="Compact"/>
+            </w:pPr>
+            <w:r>
+              <w:rPr>
+                <w:b/>
+                <w:bCs/>
+              </w:rPr>
+              <w:t xml:space="preserve">Slonimsky Harmonic</w:t>
+            </w:r>
+          </w:p>
+        </w:tc>
+        <w:tc>
+          <w:tcPr/>
+          <w:p>
+            <w:pPr>
+              <w:pStyle w:val="Compact"/>
+            </w:pPr>
+            <w:r>
+              <w:t xml:space="preserve">Intervallic symmetry, exotic harmonic movement</w:t>
+            </w:r>
+          </w:p>
+        </w:tc>
+      </w:tr>
+      <w:tr>
+        <w:tc>
+          <w:tcPr/>
+          <w:p>
+            <w:pPr>
+              <w:pStyle w:val="Compact"/>
+            </w:pPr>
+            <w:r>
+              <w:rPr>
+                <w:b/>
+                <w:bCs/>
+              </w:rPr>
+              <w:t xml:space="preserve">Andrew Hill Harmonic</w:t>
+            </w:r>
+          </w:p>
+        </w:tc>
+        <w:tc>
+          <w:tcPr/>
+          <w:p>
+            <w:pPr>
+              <w:pStyle w:val="Compact"/>
+            </w:pPr>
+            <w:r>
+              <w:t xml:space="preserve">Asymmetric phrasing, motivic mutation</w:t>
+            </w:r>
+          </w:p>
+        </w:tc>
+      </w:tr>
+      <w:tr>
+        <w:tc>
+          <w:tcPr/>
+          <w:p>
+            <w:pPr>
+              <w:pStyle w:val="Compact"/>
+            </w:pPr>
+            <w:r>
+              <w:rPr>
+                <w:b/>
+                <w:bCs/>
+              </w:rPr>
+              <w:t xml:space="preserve">Polyphonic Labyrinth</w:t>
+            </w:r>
+          </w:p>
+        </w:tc>
+        <w:tc>
+          <w:tcPr/>
+          <w:p>
+            <w:pPr>
+              <w:pStyle w:val="Compact"/>
+            </w:pPr>
+            <w:r>
+              <w:t xml:space="preserve">Dense polyphonic development</w:t>
+            </w:r>
+          </w:p>
+        </w:tc>
+      </w:tr>
     </w:tbl>
     <w:p>
       <w:pPr>
@@ -1157,13 +1359,13 @@
       </w:r>
     </w:p>
     <w:bookmarkEnd w:id="15"/>
-    <w:bookmarkStart w:id="16" w:name="zappa-disruption-engine"/>
+    <w:bookmarkStart w:id="16" w:name="wheeler-lyric-engine"/>
     <w:p>
       <w:pPr>
         <w:pStyle w:val="Heading2"/>
       </w:pPr>
       <w:r>
-        <w:t xml:space="preserve">7. Zappa Disruption Engine</w:t>
+        <w:t xml:space="preserve">7. Wheeler Lyric Engine</w:t>
       </w:r>
     </w:p>
     <w:p>
@@ -1175,13 +1377,16 @@
           <w:b/>
           <w:bCs/>
         </w:rPr>
-        <w:t xml:space="preserve">Role:</w:t>
-      </w:r>
-      <w:r>
-        <w:t xml:space="preserve"> </w:t>
-      </w:r>
-      <w:r>
-        <w:t xml:space="preserve">Secondary engine only. Never primary.</w:t>
+        <w:t xml:space="preserve">Full specification:</w:t>
+      </w:r>
+      <w:r>
+        <w:t xml:space="preserve"> </w:t>
+      </w:r>
+      <w:r>
+        <w:rPr>
+          <w:rStyle w:val="VerbatimChar"/>
+        </w:rPr>
+        <w:t xml:space="preserve">engines/wheeler_lyric_engine.md</w:t>
       </w:r>
     </w:p>
     <w:p>
@@ -1193,31 +1398,37 @@
           <w:b/>
           <w:bCs/>
         </w:rPr>
-        <w:t xml:space="preserve">Allowed contributions:</w:t>
-      </w:r>
-      <w:r>
-        <w:t xml:space="preserve"> </w:t>
-      </w:r>
-      <w:r>
-        <w:t xml:space="preserve">- Ensemble hits</w:t>
-      </w:r>
-      <w:r>
-        <w:t xml:space="preserve"> </w:t>
-      </w:r>
-      <w:r>
-        <w:t xml:space="preserve">- Rhythmic fractures</w:t>
-      </w:r>
-      <w:r>
-        <w:t xml:space="preserve"> </w:t>
-      </w:r>
-      <w:r>
-        <w:t xml:space="preserve">- Harmonic collisions</w:t>
-      </w:r>
-      <w:r>
-        <w:t xml:space="preserve"> </w:t>
-      </w:r>
-      <w:r>
-        <w:t xml:space="preserve">- Orchestral accents</w:t>
+        <w:t xml:space="preserve">Characteristics:</w:t>
+      </w:r>
+      <w:r>
+        <w:t xml:space="preserve"> </w:t>
+      </w:r>
+      <w:r>
+        <w:t xml:space="preserve">- Long melodic arcs</w:t>
+      </w:r>
+      <w:r>
+        <w:t xml:space="preserve"> </w:t>
+      </w:r>
+      <w:r>
+        <w:t xml:space="preserve">- Lyrical phrasing</w:t>
+      </w:r>
+      <w:r>
+        <w:t xml:space="preserve"> </w:t>
+      </w:r>
+      <w:r>
+        <w:t xml:space="preserve">- Slow harmonic drift</w:t>
+      </w:r>
+      <w:r>
+        <w:t xml:space="preserve"> </w:t>
+      </w:r>
+      <w:r>
+        <w:t xml:space="preserve">- Emotional openness</w:t>
+      </w:r>
+      <w:r>
+        <w:t xml:space="preserve"> </w:t>
+      </w:r>
+      <w:r>
+        <w:t xml:space="preserve">- Transparent orchestration</w:t>
       </w:r>
     </w:p>
     <w:p>
@@ -1229,25 +1440,13 @@
           <w:b/>
           <w:bCs/>
         </w:rPr>
-        <w:t xml:space="preserve">Restrictions:</w:t>
-      </w:r>
-      <w:r>
-        <w:t xml:space="preserve"> </w:t>
-      </w:r>
-      <w:r>
-        <w:t xml:space="preserve">- Used only in selected sections</w:t>
-      </w:r>
-      <w:r>
-        <w:t xml:space="preserve"> </w:t>
-      </w:r>
-      <w:r>
-        <w:t xml:space="preserve">- May not dominate the piece</w:t>
-      </w:r>
-      <w:r>
-        <w:t xml:space="preserve"> </w:t>
-      </w:r>
-      <w:r>
-        <w:t xml:space="preserve">- Must not replace the primary engine structure</w:t>
+        <w:t xml:space="preserve">Influences:</w:t>
+      </w:r>
+      <w:r>
+        <w:t xml:space="preserve"> </w:t>
+      </w:r>
+      <w:r>
+        <w:t xml:space="preserve">Kenny Wheeler, ECM lyric writing, ECM chamber jazz orchestration.</w:t>
       </w:r>
     </w:p>
     <w:p>
@@ -1259,13 +1458,103 @@
           <w:b/>
           <w:bCs/>
         </w:rPr>
-        <w:t xml:space="preserve">Recommended placement:</w:t>
-      </w:r>
-      <w:r>
-        <w:t xml:space="preserve"> </w:t>
-      </w:r>
-      <w:r>
-        <w:t xml:space="preserve">Development section, climax section, contrasting episode.</w:t>
+        <w:t xml:space="preserve">Harmony:</w:t>
+      </w:r>
+      <w:r>
+        <w:t xml:space="preserve"> </w:t>
+      </w:r>
+      <w:r>
+        <w:t xml:space="preserve">major9, maj7#11, minor9, suspended dominant colours. Avoid dense harmonic clusters.</w:t>
+      </w:r>
+    </w:p>
+    <w:p>
+      <w:pPr>
+        <w:pStyle w:val="BodyText"/>
+      </w:pPr>
+      <w:r>
+        <w:rPr>
+          <w:b/>
+          <w:bCs/>
+        </w:rPr>
+        <w:t xml:space="preserve">Guitar role:</w:t>
+      </w:r>
+      <w:r>
+        <w:t xml:space="preserve"> </w:t>
+      </w:r>
+      <w:r>
+        <w:t xml:space="preserve">Colour chords, dyads, quiet harmonic punctuation. Avoid rhythmically aggressive guitar writing.</w:t>
+      </w:r>
+    </w:p>
+    <w:p>
+      <w:pPr>
+        <w:pStyle w:val="BodyText"/>
+      </w:pPr>
+      <w:r>
+        <w:rPr>
+          <w:b/>
+          <w:bCs/>
+        </w:rPr>
+        <w:t xml:space="preserve">String roles:</w:t>
+      </w:r>
+      <w:r>
+        <w:t xml:space="preserve"> </w:t>
+      </w:r>
+      <w:r>
+        <w:t xml:space="preserve">- Violin I: Primary lyrical melody</w:t>
+      </w:r>
+      <w:r>
+        <w:t xml:space="preserve"> </w:t>
+      </w:r>
+      <w:r>
+        <w:t xml:space="preserve">- Violin II: Secondary melodic support</w:t>
+      </w:r>
+      <w:r>
+        <w:t xml:space="preserve"> </w:t>
+      </w:r>
+      <w:r>
+        <w:t xml:space="preserve">- Viola: Inner harmonic motion</w:t>
+      </w:r>
+      <w:r>
+        <w:t xml:space="preserve"> </w:t>
+      </w:r>
+      <w:r>
+        <w:t xml:space="preserve">- Cello: Lyrical bass lines</w:t>
+      </w:r>
+    </w:p>
+    <w:p>
+      <w:pPr>
+        <w:pStyle w:val="BodyText"/>
+      </w:pPr>
+      <w:r>
+        <w:rPr>
+          <w:b/>
+          <w:bCs/>
+        </w:rPr>
+        <w:t xml:space="preserve">Structural tendency:</w:t>
+      </w:r>
+      <w:r>
+        <w:t xml:space="preserve"> </w:t>
+      </w:r>
+      <w:r>
+        <w:t xml:space="preserve">A (lyrical statement) — B (harmonic expansion) — C (emotional climax) — A’ (transformed return). Dynamics evolve gradually.</w:t>
+      </w:r>
+    </w:p>
+    <w:p>
+      <w:pPr>
+        <w:pStyle w:val="BodyText"/>
+      </w:pPr>
+      <w:r>
+        <w:rPr>
+          <w:b/>
+          <w:bCs/>
+        </w:rPr>
+        <w:t xml:space="preserve">Best for:</w:t>
+      </w:r>
+      <w:r>
+        <w:t xml:space="preserve"> </w:t>
+      </w:r>
+      <w:r>
+        <w:t xml:space="preserve">Luminous ECM-style ballads, emotionally transparent chamber jazz.</w:t>
       </w:r>
     </w:p>
     <w:p>
@@ -1276,13 +1565,332 @@
       </w:r>
     </w:p>
     <w:bookmarkEnd w:id="16"/>
-    <w:bookmarkStart w:id="17" w:name="hybrid-engine-strategies"/>
+    <w:bookmarkStart w:id="17" w:name="stravinsky-chamber-pulse-engine"/>
     <w:p>
       <w:pPr>
         <w:pStyle w:val="Heading2"/>
       </w:pPr>
       <w:r>
-        <w:t xml:space="preserve">8. Hybrid Engine Strategies</w:t>
+        <w:t xml:space="preserve">8. Stravinsky Chamber Pulse Engine</w:t>
+      </w:r>
+    </w:p>
+    <w:p>
+      <w:pPr>
+        <w:pStyle w:val="FirstParagraph"/>
+      </w:pPr>
+      <w:r>
+        <w:rPr>
+          <w:b/>
+          <w:bCs/>
+        </w:rPr>
+        <w:t xml:space="preserve">Full specification:</w:t>
+      </w:r>
+      <w:r>
+        <w:t xml:space="preserve"> </w:t>
+      </w:r>
+      <w:r>
+        <w:rPr>
+          <w:rStyle w:val="VerbatimChar"/>
+        </w:rPr>
+        <w:t xml:space="preserve">engines/stravinsky_chamber_pulse_engine.md</w:t>
+      </w:r>
+    </w:p>
+    <w:p>
+      <w:pPr>
+        <w:pStyle w:val="BodyText"/>
+      </w:pPr>
+      <w:r>
+        <w:rPr>
+          <w:b/>
+          <w:bCs/>
+        </w:rPr>
+        <w:t xml:space="preserve">Characteristics:</w:t>
+      </w:r>
+      <w:r>
+        <w:t xml:space="preserve"> </w:t>
+      </w:r>
+      <w:r>
+        <w:t xml:space="preserve">- Rhythmic cells</w:t>
+      </w:r>
+      <w:r>
+        <w:t xml:space="preserve"> </w:t>
+      </w:r>
+      <w:r>
+        <w:t xml:space="preserve">- Shifting meters</w:t>
+      </w:r>
+      <w:r>
+        <w:t xml:space="preserve"> </w:t>
+      </w:r>
+      <w:r>
+        <w:t xml:space="preserve">- Sudden ensemble gestures</w:t>
+      </w:r>
+      <w:r>
+        <w:t xml:space="preserve"> </w:t>
+      </w:r>
+      <w:r>
+        <w:t xml:space="preserve">- Motivic rhythmic development</w:t>
+      </w:r>
+    </w:p>
+    <w:p>
+      <w:pPr>
+        <w:pStyle w:val="BodyText"/>
+      </w:pPr>
+      <w:r>
+        <w:rPr>
+          <w:b/>
+          <w:bCs/>
+        </w:rPr>
+        <w:t xml:space="preserve">Influences:</w:t>
+      </w:r>
+      <w:r>
+        <w:t xml:space="preserve"> </w:t>
+      </w:r>
+      <w:r>
+        <w:t xml:space="preserve">Stravinsky chamber music, modern chamber jazz, ECM rhythmic ensemble writing.</w:t>
+      </w:r>
+    </w:p>
+    <w:p>
+      <w:pPr>
+        <w:pStyle w:val="BodyText"/>
+      </w:pPr>
+      <w:r>
+        <w:rPr>
+          <w:b/>
+          <w:bCs/>
+        </w:rPr>
+        <w:t xml:space="preserve">Harmony:</w:t>
+      </w:r>
+      <w:r>
+        <w:t xml:space="preserve"> </w:t>
+      </w:r>
+      <w:r>
+        <w:t xml:space="preserve">Modal, quartal, polychord colours, occasional sharp dissonance. Avoid romantic harmonic language.</w:t>
+      </w:r>
+    </w:p>
+    <w:p>
+      <w:pPr>
+        <w:pStyle w:val="BodyText"/>
+      </w:pPr>
+      <w:r>
+        <w:rPr>
+          <w:b/>
+          <w:bCs/>
+        </w:rPr>
+        <w:t xml:space="preserve">Guitar role:</w:t>
+      </w:r>
+      <w:r>
+        <w:t xml:space="preserve"> </w:t>
+      </w:r>
+      <w:r>
+        <w:t xml:space="preserve">Dyads, rhythmic chords, percussive attacks.</w:t>
+      </w:r>
+    </w:p>
+    <w:p>
+      <w:pPr>
+        <w:pStyle w:val="BodyText"/>
+      </w:pPr>
+      <w:r>
+        <w:rPr>
+          <w:b/>
+          <w:bCs/>
+        </w:rPr>
+        <w:t xml:space="preserve">String roles:</w:t>
+      </w:r>
+      <w:r>
+        <w:t xml:space="preserve"> </w:t>
+      </w:r>
+      <w:r>
+        <w:t xml:space="preserve">- Violin I: Rhythmic motif leader</w:t>
+      </w:r>
+      <w:r>
+        <w:t xml:space="preserve"> </w:t>
+      </w:r>
+      <w:r>
+        <w:t xml:space="preserve">- Violin II: Counter-rhythm layer</w:t>
+      </w:r>
+      <w:r>
+        <w:t xml:space="preserve"> </w:t>
+      </w:r>
+      <w:r>
+        <w:t xml:space="preserve">- Viola: Inner rhythmic motor</w:t>
+      </w:r>
+      <w:r>
+        <w:t xml:space="preserve"> </w:t>
+      </w:r>
+      <w:r>
+        <w:t xml:space="preserve">- Cello: Percussive harmonic anchor</w:t>
+      </w:r>
+    </w:p>
+    <w:p>
+      <w:pPr>
+        <w:pStyle w:val="BodyText"/>
+      </w:pPr>
+      <w:r>
+        <w:rPr>
+          <w:b/>
+          <w:bCs/>
+        </w:rPr>
+        <w:t xml:space="preserve">Structural tendency:</w:t>
+      </w:r>
+      <w:r>
+        <w:t xml:space="preserve"> </w:t>
+      </w:r>
+      <w:r>
+        <w:t xml:space="preserve">Intro (rhythmic cell) — A (development) — B (contrasting section) — A’ (recombined cell patterns) — Coda (rhythmic dissolution).</w:t>
+      </w:r>
+    </w:p>
+    <w:p>
+      <w:pPr>
+        <w:pStyle w:val="BodyText"/>
+      </w:pPr>
+      <w:r>
+        <w:rPr>
+          <w:b/>
+          <w:bCs/>
+        </w:rPr>
+        <w:t xml:space="preserve">Best for:</w:t>
+      </w:r>
+      <w:r>
+        <w:t xml:space="preserve"> </w:t>
+      </w:r>
+      <w:r>
+        <w:t xml:space="preserve">Rhythmically energetic chamber pieces, syncopated ensemble writing.</w:t>
+      </w:r>
+    </w:p>
+    <w:p>
+      <w:r>
+        <w:pict>
+          <v:rect style="width:0;height:1.5pt" o:hralign="center" o:hrstd="t" o:hr="t"/>
+        </w:pict>
+      </w:r>
+    </w:p>
+    <w:bookmarkEnd w:id="17"/>
+    <w:bookmarkStart w:id="18" w:name="zappa-disruption-engine"/>
+    <w:p>
+      <w:pPr>
+        <w:pStyle w:val="Heading2"/>
+      </w:pPr>
+      <w:r>
+        <w:t xml:space="preserve">9. Zappa Disruption Engine</w:t>
+      </w:r>
+    </w:p>
+    <w:p>
+      <w:pPr>
+        <w:pStyle w:val="FirstParagraph"/>
+      </w:pPr>
+      <w:r>
+        <w:rPr>
+          <w:b/>
+          <w:bCs/>
+        </w:rPr>
+        <w:t xml:space="preserve">Role:</w:t>
+      </w:r>
+      <w:r>
+        <w:t xml:space="preserve"> </w:t>
+      </w:r>
+      <w:r>
+        <w:t xml:space="preserve">Secondary engine only. Never primary.</w:t>
+      </w:r>
+    </w:p>
+    <w:p>
+      <w:pPr>
+        <w:pStyle w:val="BodyText"/>
+      </w:pPr>
+      <w:r>
+        <w:rPr>
+          <w:b/>
+          <w:bCs/>
+        </w:rPr>
+        <w:t xml:space="preserve">Allowed contributions:</w:t>
+      </w:r>
+      <w:r>
+        <w:t xml:space="preserve"> </w:t>
+      </w:r>
+      <w:r>
+        <w:t xml:space="preserve">- Ensemble hits</w:t>
+      </w:r>
+      <w:r>
+        <w:t xml:space="preserve"> </w:t>
+      </w:r>
+      <w:r>
+        <w:t xml:space="preserve">- Rhythmic fractures</w:t>
+      </w:r>
+      <w:r>
+        <w:t xml:space="preserve"> </w:t>
+      </w:r>
+      <w:r>
+        <w:t xml:space="preserve">- Harmonic collisions</w:t>
+      </w:r>
+      <w:r>
+        <w:t xml:space="preserve"> </w:t>
+      </w:r>
+      <w:r>
+        <w:t xml:space="preserve">- Orchestral accents</w:t>
+      </w:r>
+    </w:p>
+    <w:p>
+      <w:pPr>
+        <w:pStyle w:val="BodyText"/>
+      </w:pPr>
+      <w:r>
+        <w:rPr>
+          <w:b/>
+          <w:bCs/>
+        </w:rPr>
+        <w:t xml:space="preserve">Restrictions:</w:t>
+      </w:r>
+      <w:r>
+        <w:t xml:space="preserve"> </w:t>
+      </w:r>
+      <w:r>
+        <w:t xml:space="preserve">- Used only in selected sections</w:t>
+      </w:r>
+      <w:r>
+        <w:t xml:space="preserve"> </w:t>
+      </w:r>
+      <w:r>
+        <w:t xml:space="preserve">- May not dominate the piece</w:t>
+      </w:r>
+      <w:r>
+        <w:t xml:space="preserve"> </w:t>
+      </w:r>
+      <w:r>
+        <w:t xml:space="preserve">- Must not replace the primary engine structure</w:t>
+      </w:r>
+    </w:p>
+    <w:p>
+      <w:pPr>
+        <w:pStyle w:val="BodyText"/>
+      </w:pPr>
+      <w:r>
+        <w:rPr>
+          <w:b/>
+          <w:bCs/>
+        </w:rPr>
+        <w:t xml:space="preserve">Recommended placement:</w:t>
+      </w:r>
+      <w:r>
+        <w:t xml:space="preserve"> </w:t>
+      </w:r>
+      <w:r>
+        <w:t xml:space="preserve">Development section, climax section, contrasting episode.</w:t>
+      </w:r>
+    </w:p>
+    <w:p>
+      <w:r>
+        <w:pict>
+          <v:rect style="width:0;height:1.5pt" o:hralign="center" o:hrstd="t" o:hr="t"/>
+        </w:pict>
+      </w:r>
+    </w:p>
+    <w:bookmarkEnd w:id="18"/>
+    <w:bookmarkStart w:id="19" w:name="hybrid-engine-strategies"/>
+    <w:p>
+      <w:pPr>
+        <w:pStyle w:val="Heading2"/>
+      </w:pPr>
+      <w:r>
+        <w:t xml:space="preserve">10. Hybrid Engine Strategies</w:t>
       </w:r>
     </w:p>
     <w:p>
@@ -1543,6 +2151,76 @@
           </w:p>
         </w:tc>
       </w:tr>
+      <w:tr>
+        <w:tc>
+          <w:tcPr/>
+          <w:p>
+            <w:pPr>
+              <w:pStyle w:val="Compact"/>
+            </w:pPr>
+            <w:r>
+              <w:t xml:space="preserve">Wheeler Lyric</w:t>
+            </w:r>
+          </w:p>
+        </w:tc>
+        <w:tc>
+          <w:tcPr/>
+          <w:p>
+            <w:pPr>
+              <w:pStyle w:val="Compact"/>
+            </w:pPr>
+            <w:r>
+              <w:t xml:space="preserve">Frisell</w:t>
+            </w:r>
+          </w:p>
+        </w:tc>
+        <w:tc>
+          <w:tcPr/>
+          <w:p>
+            <w:pPr>
+              <w:pStyle w:val="Compact"/>
+            </w:pPr>
+            <w:r>
+              <w:t xml:space="preserve">Lyric + atmospheric</w:t>
+            </w:r>
+          </w:p>
+        </w:tc>
+      </w:tr>
+      <w:tr>
+        <w:tc>
+          <w:tcPr/>
+          <w:p>
+            <w:pPr>
+              <w:pStyle w:val="Compact"/>
+            </w:pPr>
+            <w:r>
+              <w:t xml:space="preserve">Stravinsky Chamber Pulse</w:t>
+            </w:r>
+          </w:p>
+        </w:tc>
+        <w:tc>
+          <w:tcPr/>
+          <w:p>
+            <w:pPr>
+              <w:pStyle w:val="Compact"/>
+            </w:pPr>
+            <w:r>
+              <w:t xml:space="preserve">Zappa</w:t>
+            </w:r>
+          </w:p>
+        </w:tc>
+        <w:tc>
+          <w:tcPr/>
+          <w:p>
+            <w:pPr>
+              <w:pStyle w:val="Compact"/>
+            </w:pPr>
+            <w:r>
+              <w:t xml:space="preserve">Rhythmic + disruptive accents</w:t>
+            </w:r>
+          </w:p>
+        </w:tc>
+      </w:tr>
     </w:tbl>
     <w:p>
       <w:pPr>
@@ -1569,14 +2247,14 @@
         </w:pict>
       </w:r>
     </w:p>
-    <w:bookmarkEnd w:id="17"/>
-    <w:bookmarkStart w:id="18" w:name="album-rotation-strategy"/>
+    <w:bookmarkEnd w:id="19"/>
+    <w:bookmarkStart w:id="20" w:name="album-rotation-strategy"/>
     <w:p>
       <w:pPr>
         <w:pStyle w:val="Heading2"/>
       </w:pPr>
       <w:r>
-        <w:t xml:space="preserve">9. Album Rotation Strategy</w:t>
+        <w:t xml:space="preserve">11. Album Rotation Strategy</w:t>
       </w:r>
     </w:p>
     <w:p>
@@ -1890,14 +2568,14 @@
         </w:pict>
       </w:r>
     </w:p>
-    <w:bookmarkEnd w:id="18"/>
-    <w:bookmarkStart w:id="19" w:name="score-engraving-standards"/>
+    <w:bookmarkEnd w:id="20"/>
+    <w:bookmarkStart w:id="21" w:name="score-engraving-standards"/>
     <w:p>
       <w:pPr>
         <w:pStyle w:val="Heading2"/>
       </w:pPr>
       <w:r>
-        <w:t xml:space="preserve">10. Score Engraving Standards</w:t>
+        <w:t xml:space="preserve">12. Score Engraving Standards</w:t>
       </w:r>
     </w:p>
     <w:p>
@@ -2046,14 +2724,14 @@
         </w:pict>
       </w:r>
     </w:p>
-    <w:bookmarkEnd w:id="19"/>
-    <w:bookmarkStart w:id="20" w:name="musicxml-validation-rules"/>
+    <w:bookmarkEnd w:id="21"/>
+    <w:bookmarkStart w:id="22" w:name="musicxml-validation-rules"/>
     <w:p>
       <w:pPr>
         <w:pStyle w:val="Heading2"/>
       </w:pPr>
       <w:r>
-        <w:t xml:space="preserve">11. MusicXML Validation Rules</w:t>
+        <w:t xml:space="preserve">13. MusicXML Validation Rules</w:t>
       </w:r>
     </w:p>
     <w:p>
@@ -2268,14 +2946,14 @@
         </w:pict>
       </w:r>
     </w:p>
-    <w:bookmarkEnd w:id="20"/>
-    <w:bookmarkStart w:id="21" w:name="composition-quality-rules-gce-9"/>
+    <w:bookmarkEnd w:id="22"/>
+    <w:bookmarkStart w:id="23" w:name="composition-quality-rules-gce-9"/>
     <w:p>
       <w:pPr>
         <w:pStyle w:val="Heading2"/>
       </w:pPr>
       <w:r>
-        <w:t xml:space="preserve">12. Composition Quality Rules (GCE ≥ 9)</w:t>
+        <w:t xml:space="preserve">14. Composition Quality Rules (GCE ≥ 9)</w:t>
       </w:r>
     </w:p>
     <w:p>
@@ -2299,7 +2977,66 @@
         <w:t xml:space="preserve"> </w:t>
       </w:r>
       <w:r>
-        <w:t xml:space="preserve">before export.</w:t>
+        <w:t xml:space="preserve">before export. For</w:t>
+      </w:r>
+      <w:r>
+        <w:t xml:space="preserve"> </w:t>
+      </w:r>
+      <w:r>
+        <w:rPr>
+          <w:b/>
+          <w:bCs/>
+        </w:rPr>
+        <w:t xml:space="preserve">Final Pass</w:t>
+      </w:r>
+      <w:r>
+        <w:t xml:space="preserve"> </w:t>
+      </w:r>
+      <w:r>
+        <w:t xml:space="preserve">mode, require</w:t>
+      </w:r>
+      <w:r>
+        <w:t xml:space="preserve"> </w:t>
+      </w:r>
+      <w:r>
+        <w:rPr>
+          <w:b/>
+          <w:bCs/>
+        </w:rPr>
+        <w:t xml:space="preserve">GCE ≥ 9.5</w:t>
+      </w:r>
+      <w:r>
+        <w:t xml:space="preserve">.</w:t>
+      </w:r>
+    </w:p>
+    <w:p>
+      <w:pPr>
+        <w:pStyle w:val="BodyText"/>
+      </w:pPr>
+      <w:r>
+        <w:rPr>
+          <w:b/>
+          <w:bCs/>
+        </w:rPr>
+        <w:t xml:space="preserve">Final Pass workflow:</w:t>
+      </w:r>
+      <w:r>
+        <w:t xml:space="preserve"> </w:t>
+      </w:r>
+      <w:r>
+        <w:t xml:space="preserve">Plan full structure first; verify harmony and orchestration internally; apply engraving rules; validate MusicXML; export only when GCE ≥ 9.5. Do not emit intermediate drafts. See</w:t>
+      </w:r>
+      <w:r>
+        <w:t xml:space="preserve"> </w:t>
+      </w:r>
+      <w:r>
+        <w:rPr>
+          <w:rStyle w:val="VerbatimChar"/>
+        </w:rPr>
+        <w:t xml:space="preserve">rules/final-pass-generation-mode.md</w:t>
+      </w:r>
+      <w:r>
+        <w:t xml:space="preserve">.</w:t>
       </w:r>
     </w:p>
     <w:p>
@@ -2378,14 +3115,14 @@
         </w:pict>
       </w:r>
     </w:p>
-    <w:bookmarkEnd w:id="21"/>
-    <w:bookmarkStart w:id="22" w:name="repository-structure-rules"/>
+    <w:bookmarkEnd w:id="23"/>
+    <w:bookmarkStart w:id="25" w:name="repository-structure-rules"/>
     <w:p>
       <w:pPr>
         <w:pStyle w:val="Heading2"/>
       </w:pPr>
       <w:r>
-        <w:t xml:space="preserve">13. Repository Structure Rules</w:t>
+        <w:t xml:space="preserve">15. Repository Structure Rules</w:t>
       </w:r>
     </w:p>
     <w:p>
@@ -2582,7 +3319,13 @@
           <w:b/>
           <w:bCs/>
         </w:rPr>
-        <w:t xml:space="preserve">Full specification:</w:t>
+        <w:t xml:space="preserve">Version naming (mandatory):</w:t>
+      </w:r>
+      <w:r>
+        <w:t xml:space="preserve"> </w:t>
+      </w:r>
+      <w:r>
+        <w:t xml:space="preserve">All new compositions must use format</w:t>
       </w:r>
       <w:r>
         <w:t xml:space="preserve"> </w:t>
@@ -2591,60 +3334,10 @@
         <w:rPr>
           <w:rStyle w:val="VerbatimChar"/>
         </w:rPr>
-        <w:t xml:space="preserve">rules/one-piece-one-folder.md</w:t>
-      </w:r>
-    </w:p>
-    <w:p>
-      <w:r>
-        <w:pict>
-          <v:rect style="width:0;height:1.5pt" o:hralign="center" o:hrstd="t" o:hr="t"/>
-        </w:pict>
-      </w:r>
-    </w:p>
-    <w:bookmarkEnd w:id="22"/>
-    <w:bookmarkStart w:id="23" w:name="synchronization-rule"/>
-    <w:p>
-      <w:pPr>
-        <w:pStyle w:val="Heading2"/>
-      </w:pPr>
-      <w:r>
-        <w:t xml:space="preserve">14. Synchronization Rule</w:t>
-      </w:r>
-    </w:p>
-    <w:p>
-      <w:pPr>
-        <w:pStyle w:val="FirstParagraph"/>
-      </w:pPr>
-      <w:r>
-        <w:rPr>
-          <w:b/>
-          <w:bCs/>
-        </w:rPr>
-        <w:t xml:space="preserve">Whenever engines or composition rules change:</w:t>
-      </w:r>
-    </w:p>
-    <w:p>
-      <w:pPr>
-        <w:pStyle w:val="BodyText"/>
-      </w:pPr>
-      <w:r>
-        <w:t xml:space="preserve">Update</w:t>
-      </w:r>
-      <w:r>
-        <w:t xml:space="preserve"> </w:t>
-      </w:r>
-      <w:r>
-        <w:rPr>
-          <w:b/>
-          <w:bCs/>
-        </w:rPr>
-        <w:t xml:space="preserve">BOTH</w:t>
-      </w:r>
-      <w:r>
-        <w:t xml:space="preserve"> </w:t>
-      </w:r>
-      <w:r>
-        <w:t xml:space="preserve">files:</w:t>
+        <w:t xml:space="preserve">V{number}_{title}.musicxml</w:t>
+      </w:r>
+      <w:r>
+        <w:t xml:space="preserve">.</w:t>
       </w:r>
     </w:p>
     <w:p>
@@ -2656,10 +3349,7 @@
         </w:numPr>
       </w:pPr>
       <w:r>
-        <w:rPr>
-          <w:rStyle w:val="VerbatimChar"/>
-        </w:rPr>
-        <w:t xml:space="preserve">docs/composition_engine_reference.md</w:t>
+        <w:t xml:space="preserve">Never overwrite earlier versions</w:t>
       </w:r>
     </w:p>
     <w:p>
@@ -2671,18 +3361,39 @@
         </w:numPr>
       </w:pPr>
       <w:r>
+        <w:t xml:space="preserve">Increment version number for every revision</w:t>
+      </w:r>
+    </w:p>
+    <w:p>
+      <w:pPr>
+        <w:pStyle w:val="Compact"/>
+        <w:numPr>
+          <w:ilvl w:val="0"/>
+          <w:numId w:val="1004"/>
+        </w:numPr>
+      </w:pPr>
+      <w:r>
+        <w:t xml:space="preserve">Store all versions inside the same piece folder</w:t>
+      </w:r>
+    </w:p>
+    <w:p>
+      <w:pPr>
+        <w:pStyle w:val="FirstParagraph"/>
+      </w:pPr>
+      <w:r>
+        <w:t xml:space="preserve">Example:</w:t>
+      </w:r>
+      <w:r>
+        <w:t xml:space="preserve"> </w:t>
+      </w:r>
+      <w:r>
         <w:rPr>
           <w:rStyle w:val="VerbatimChar"/>
         </w:rPr>
-        <w:t xml:space="preserve">docs/composition_engine_reference.docx</w:t>
-      </w:r>
-    </w:p>
-    <w:p>
-      <w:pPr>
-        <w:pStyle w:val="FirstParagraph"/>
-      </w:pPr>
-      <w:r>
-        <w:t xml:space="preserve">Regenerate the</w:t>
+        <w:t xml:space="preserve">V1_Home_Engine_Scofield.musicxml</w:t>
+      </w:r>
+      <w:r>
+        <w:t xml:space="preserve">,</w:t>
       </w:r>
       <w:r>
         <w:t xml:space="preserve"> </w:t>
@@ -2691,13 +3402,19 @@
         <w:rPr>
           <w:rStyle w:val="VerbatimChar"/>
         </w:rPr>
-        <w:t xml:space="preserve">.docx</w:t>
-      </w:r>
-      <w:r>
-        <w:t xml:space="preserve"> </w:t>
-      </w:r>
-      <w:r>
-        <w:t xml:space="preserve">from the</w:t>
+        <w:t xml:space="preserve">V2_Home_Engine_Scofield.musicxml</w:t>
+      </w:r>
+    </w:p>
+    <w:p>
+      <w:pPr>
+        <w:pStyle w:val="BodyText"/>
+      </w:pPr>
+      <w:r>
+        <w:rPr>
+          <w:b/>
+          <w:bCs/>
+        </w:rPr>
+        <w:t xml:space="preserve">Full specification:</w:t>
       </w:r>
       <w:r>
         <w:t xml:space="preserve"> </w:t>
@@ -2706,42 +3423,7 @@
         <w:rPr>
           <w:rStyle w:val="VerbatimChar"/>
         </w:rPr>
-        <w:t xml:space="preserve">.md</w:t>
-      </w:r>
-      <w:r>
-        <w:t xml:space="preserve"> </w:t>
-      </w:r>
-      <w:r>
-        <w:t xml:space="preserve">using pandoc:</w:t>
-      </w:r>
-    </w:p>
-    <w:p>
-      <w:pPr>
-        <w:pStyle w:val="SourceCode"/>
-      </w:pPr>
-      <w:r>
-        <w:rPr>
-          <w:rStyle w:val="ExtensionTok"/>
-        </w:rPr>
-        <w:t xml:space="preserve">pandoc</w:t>
-      </w:r>
-      <w:r>
-        <w:rPr>
-          <w:rStyle w:val="NormalTok"/>
-        </w:rPr>
-        <w:t xml:space="preserve"> docs/composition_engine_reference.md </w:t>
-      </w:r>
-      <w:r>
-        <w:rPr>
-          <w:rStyle w:val="AttributeTok"/>
-        </w:rPr>
-        <w:t xml:space="preserve">-o</w:t>
-      </w:r>
-      <w:r>
-        <w:rPr>
-          <w:rStyle w:val="NormalTok"/>
-        </w:rPr>
-        <w:t xml:space="preserve"> docs/composition_engine_reference.docx</w:t>
+        <w:t xml:space="preserve">rules/one-piece-one-folder.md</w:t>
       </w:r>
     </w:p>
     <w:p>
@@ -2751,8 +3433,601 @@
         </w:pict>
       </w:r>
     </w:p>
-    <w:bookmarkEnd w:id="23"/>
-    <w:bookmarkStart w:id="24" w:name="reference-locations"/>
+    <w:bookmarkStart w:id="24" w:name="repository-composition-folder-structure"/>
+    <w:p>
+      <w:pPr>
+        <w:pStyle w:val="Heading3"/>
+      </w:pPr>
+      <w:r>
+        <w:t xml:space="preserve">Repository Composition Folder Structure</w:t>
+      </w:r>
+    </w:p>
+    <w:p>
+      <w:pPr>
+        <w:pStyle w:val="FirstParagraph"/>
+      </w:pPr>
+      <w:r>
+        <w:t xml:space="preserve">Every composition must have a folder with identical subdirectories. No files should exist directly in</w:t>
+      </w:r>
+      <w:r>
+        <w:t xml:space="preserve"> </w:t>
+      </w:r>
+      <w:r>
+        <w:rPr>
+          <w:rStyle w:val="VerbatimChar"/>
+        </w:rPr>
+        <w:t xml:space="preserve">compositions/</w:t>
+      </w:r>
+      <w:r>
+        <w:t xml:space="preserve">.</w:t>
+      </w:r>
+    </w:p>
+    <w:p>
+      <w:pPr>
+        <w:pStyle w:val="BodyText"/>
+      </w:pPr>
+      <w:r>
+        <w:rPr>
+          <w:b/>
+          <w:bCs/>
+        </w:rPr>
+        <w:t xml:space="preserve">Canonical structure:</w:t>
+      </w:r>
+    </w:p>
+    <w:p>
+      <w:pPr>
+        <w:pStyle w:val="SourceCode"/>
+      </w:pPr>
+      <w:r>
+        <w:rPr>
+          <w:rStyle w:val="VerbatimChar"/>
+        </w:rPr>
+        <w:t xml:space="preserve">compositions/</w:t>
+      </w:r>
+      <w:r>
+        <w:br/>
+      </w:r>
+      <w:r>
+        <w:rPr>
+          <w:rStyle w:val="VerbatimChar"/>
+        </w:rPr>
+        <w:t xml:space="preserve">    composition-name/</w:t>
+      </w:r>
+      <w:r>
+        <w:br/>
+      </w:r>
+      <w:r>
+        <w:rPr>
+          <w:rStyle w:val="VerbatimChar"/>
+        </w:rPr>
+        <w:t xml:space="preserve">        archive/</w:t>
+      </w:r>
+      <w:r>
+        <w:br/>
+      </w:r>
+      <w:r>
+        <w:rPr>
+          <w:rStyle w:val="VerbatimChar"/>
+        </w:rPr>
+        <w:t xml:space="preserve">        audio/</w:t>
+      </w:r>
+      <w:r>
+        <w:br/>
+      </w:r>
+      <w:r>
+        <w:rPr>
+          <w:rStyle w:val="VerbatimChar"/>
+        </w:rPr>
+        <w:t xml:space="preserve">        musicxml/</w:t>
+      </w:r>
+      <w:r>
+        <w:br/>
+      </w:r>
+      <w:r>
+        <w:rPr>
+          <w:rStyle w:val="VerbatimChar"/>
+        </w:rPr>
+        <w:t xml:space="preserve">        pdf/</w:t>
+      </w:r>
+      <w:r>
+        <w:br/>
+      </w:r>
+      <w:r>
+        <w:rPr>
+          <w:rStyle w:val="VerbatimChar"/>
+        </w:rPr>
+        <w:t xml:space="preserve">        sibelius/</w:t>
+      </w:r>
+      <w:r>
+        <w:br/>
+      </w:r>
+      <w:r>
+        <w:rPr>
+          <w:rStyle w:val="VerbatimChar"/>
+        </w:rPr>
+        <w:t xml:space="preserve">        sketches/</w:t>
+      </w:r>
+      <w:r>
+        <w:br/>
+      </w:r>
+      <w:r>
+        <w:rPr>
+          <w:rStyle w:val="VerbatimChar"/>
+        </w:rPr>
+        <w:t xml:space="preserve">        video/</w:t>
+      </w:r>
+    </w:p>
+    <w:p>
+      <w:pPr>
+        <w:pStyle w:val="FirstParagraph"/>
+      </w:pPr>
+      <w:r>
+        <w:rPr>
+          <w:b/>
+          <w:bCs/>
+        </w:rPr>
+        <w:t xml:space="preserve">Where each file type belongs:</w:t>
+      </w:r>
+    </w:p>
+    <w:tbl>
+      <w:tblPr>
+        <w:tblStyle w:val="Table"/>
+        <w:tblW w:type="auto" w:w="0"/>
+        <w:tblLook w:firstRow="1" w:lastRow="0" w:firstColumn="0" w:lastColumn="0" w:noHBand="0" w:noVBand="0" w:val="0020"/>
+      </w:tblPr>
+      <w:tblGrid>
+        <w:gridCol w:w="3960"/>
+        <w:gridCol w:w="3960"/>
+      </w:tblGrid>
+      <w:tr>
+        <w:trPr>
+          <w:tblHeader w:val="on"/>
+        </w:trPr>
+        <w:tc>
+          <w:tcPr/>
+          <w:p>
+            <w:pPr>
+              <w:pStyle w:val="Compact"/>
+            </w:pPr>
+            <w:r>
+              <w:t xml:space="preserve">File Type</w:t>
+            </w:r>
+          </w:p>
+        </w:tc>
+        <w:tc>
+          <w:tcPr/>
+          <w:p>
+            <w:pPr>
+              <w:pStyle w:val="Compact"/>
+            </w:pPr>
+            <w:r>
+              <w:t xml:space="preserve">Destination</w:t>
+            </w:r>
+          </w:p>
+        </w:tc>
+      </w:tr>
+      <w:tr>
+        <w:tc>
+          <w:tcPr/>
+          <w:p>
+            <w:pPr>
+              <w:pStyle w:val="Compact"/>
+            </w:pPr>
+            <w:r>
+              <w:t xml:space="preserve">MusicXML</w:t>
+            </w:r>
+          </w:p>
+        </w:tc>
+        <w:tc>
+          <w:tcPr/>
+          <w:p>
+            <w:pPr>
+              <w:pStyle w:val="Compact"/>
+            </w:pPr>
+            <w:r>
+              <w:t xml:space="preserve">musicxml/</w:t>
+            </w:r>
+          </w:p>
+        </w:tc>
+      </w:tr>
+      <w:tr>
+        <w:tc>
+          <w:tcPr/>
+          <w:p>
+            <w:pPr>
+              <w:pStyle w:val="Compact"/>
+            </w:pPr>
+            <w:r>
+              <w:t xml:space="preserve">Sibelius</w:t>
+            </w:r>
+          </w:p>
+        </w:tc>
+        <w:tc>
+          <w:tcPr/>
+          <w:p>
+            <w:pPr>
+              <w:pStyle w:val="Compact"/>
+            </w:pPr>
+            <w:r>
+              <w:t xml:space="preserve">sibelius/</w:t>
+            </w:r>
+          </w:p>
+        </w:tc>
+      </w:tr>
+      <w:tr>
+        <w:tc>
+          <w:tcPr/>
+          <w:p>
+            <w:pPr>
+              <w:pStyle w:val="Compact"/>
+            </w:pPr>
+            <w:r>
+              <w:t xml:space="preserve">Exported PDF</w:t>
+            </w:r>
+          </w:p>
+        </w:tc>
+        <w:tc>
+          <w:tcPr/>
+          <w:p>
+            <w:pPr>
+              <w:pStyle w:val="Compact"/>
+            </w:pPr>
+            <w:r>
+              <w:t xml:space="preserve">pdf/</w:t>
+            </w:r>
+          </w:p>
+        </w:tc>
+      </w:tr>
+      <w:tr>
+        <w:tc>
+          <w:tcPr/>
+          <w:p>
+            <w:pPr>
+              <w:pStyle w:val="Compact"/>
+            </w:pPr>
+            <w:r>
+              <w:t xml:space="preserve">Audio bounce</w:t>
+            </w:r>
+          </w:p>
+        </w:tc>
+        <w:tc>
+          <w:tcPr/>
+          <w:p>
+            <w:pPr>
+              <w:pStyle w:val="Compact"/>
+            </w:pPr>
+            <w:r>
+              <w:t xml:space="preserve">audio/</w:t>
+            </w:r>
+          </w:p>
+        </w:tc>
+      </w:tr>
+      <w:tr>
+        <w:tc>
+          <w:tcPr/>
+          <w:p>
+            <w:pPr>
+              <w:pStyle w:val="Compact"/>
+            </w:pPr>
+            <w:r>
+              <w:t xml:space="preserve">Video render</w:t>
+            </w:r>
+          </w:p>
+        </w:tc>
+        <w:tc>
+          <w:tcPr/>
+          <w:p>
+            <w:pPr>
+              <w:pStyle w:val="Compact"/>
+            </w:pPr>
+            <w:r>
+              <w:t xml:space="preserve">video/</w:t>
+            </w:r>
+          </w:p>
+        </w:tc>
+      </w:tr>
+      <w:tr>
+        <w:tc>
+          <w:tcPr/>
+          <w:p>
+            <w:pPr>
+              <w:pStyle w:val="Compact"/>
+            </w:pPr>
+            <w:r>
+              <w:t xml:space="preserve">Draft ideas</w:t>
+            </w:r>
+          </w:p>
+        </w:tc>
+        <w:tc>
+          <w:tcPr/>
+          <w:p>
+            <w:pPr>
+              <w:pStyle w:val="Compact"/>
+            </w:pPr>
+            <w:r>
+              <w:t xml:space="preserve">sketches/</w:t>
+            </w:r>
+          </w:p>
+        </w:tc>
+      </w:tr>
+      <w:tr>
+        <w:tc>
+          <w:tcPr/>
+          <w:p>
+            <w:pPr>
+              <w:pStyle w:val="Compact"/>
+            </w:pPr>
+            <w:r>
+              <w:t xml:space="preserve">Old versions</w:t>
+            </w:r>
+          </w:p>
+        </w:tc>
+        <w:tc>
+          <w:tcPr/>
+          <w:p>
+            <w:pPr>
+              <w:pStyle w:val="Compact"/>
+            </w:pPr>
+            <w:r>
+              <w:t xml:space="preserve">archive/</w:t>
+            </w:r>
+          </w:p>
+        </w:tc>
+      </w:tr>
+    </w:tbl>
+    <w:p>
+      <w:pPr>
+        <w:pStyle w:val="BodyText"/>
+      </w:pPr>
+      <w:r>
+        <w:rPr>
+          <w:b/>
+          <w:bCs/>
+        </w:rPr>
+        <w:t xml:space="preserve">When creating a new composition:</w:t>
+      </w:r>
+    </w:p>
+    <w:p>
+      <w:pPr>
+        <w:pStyle w:val="Compact"/>
+        <w:numPr>
+          <w:ilvl w:val="0"/>
+          <w:numId w:val="1005"/>
+        </w:numPr>
+      </w:pPr>
+      <w:r>
+        <w:t xml:space="preserve">Create a folder using kebab-case title.</w:t>
+      </w:r>
+    </w:p>
+    <w:p>
+      <w:pPr>
+        <w:pStyle w:val="Compact"/>
+        <w:numPr>
+          <w:ilvl w:val="0"/>
+          <w:numId w:val="1005"/>
+        </w:numPr>
+      </w:pPr>
+      <w:r>
+        <w:t xml:space="preserve">Create all seven subdirectories inside.</w:t>
+      </w:r>
+    </w:p>
+    <w:p>
+      <w:pPr>
+        <w:pStyle w:val="Compact"/>
+        <w:numPr>
+          <w:ilvl w:val="0"/>
+          <w:numId w:val="1005"/>
+        </w:numPr>
+      </w:pPr>
+      <w:r>
+        <w:t xml:space="preserve">Save files according to type.</w:t>
+      </w:r>
+    </w:p>
+    <w:p>
+      <w:pPr>
+        <w:pStyle w:val="Compact"/>
+        <w:numPr>
+          <w:ilvl w:val="0"/>
+          <w:numId w:val="1005"/>
+        </w:numPr>
+      </w:pPr>
+      <w:r>
+        <w:t xml:space="preserve">Never save files directly inside</w:t>
+      </w:r>
+      <w:r>
+        <w:t xml:space="preserve"> </w:t>
+      </w:r>
+      <w:r>
+        <w:rPr>
+          <w:rStyle w:val="VerbatimChar"/>
+        </w:rPr>
+        <w:t xml:space="preserve">compositions/</w:t>
+      </w:r>
+      <w:r>
+        <w:t xml:space="preserve">.</w:t>
+      </w:r>
+    </w:p>
+    <w:p>
+      <w:pPr>
+        <w:pStyle w:val="FirstParagraph"/>
+      </w:pPr>
+      <w:r>
+        <w:rPr>
+          <w:b/>
+          <w:bCs/>
+        </w:rPr>
+        <w:t xml:space="preserve">Full specification:</w:t>
+      </w:r>
+      <w:r>
+        <w:t xml:space="preserve"> </w:t>
+      </w:r>
+      <w:r>
+        <w:rPr>
+          <w:rStyle w:val="VerbatimChar"/>
+        </w:rPr>
+        <w:t xml:space="preserve">rules/composition-folder-structure.md</w:t>
+      </w:r>
+    </w:p>
+    <w:p>
+      <w:r>
+        <w:pict>
+          <v:rect style="width:0;height:1.5pt" o:hralign="center" o:hrstd="t" o:hr="t"/>
+        </w:pict>
+      </w:r>
+    </w:p>
+    <w:bookmarkEnd w:id="24"/>
+    <w:bookmarkEnd w:id="25"/>
+    <w:bookmarkStart w:id="26" w:name="synchronization-rule"/>
+    <w:p>
+      <w:pPr>
+        <w:pStyle w:val="Heading2"/>
+      </w:pPr>
+      <w:r>
+        <w:t xml:space="preserve">16. Synchronization Rule</w:t>
+      </w:r>
+    </w:p>
+    <w:p>
+      <w:pPr>
+        <w:pStyle w:val="FirstParagraph"/>
+      </w:pPr>
+      <w:r>
+        <w:rPr>
+          <w:b/>
+          <w:bCs/>
+        </w:rPr>
+        <w:t xml:space="preserve">Whenever engines or composition rules change:</w:t>
+      </w:r>
+    </w:p>
+    <w:p>
+      <w:pPr>
+        <w:pStyle w:val="BodyText"/>
+      </w:pPr>
+      <w:r>
+        <w:t xml:space="preserve">Update</w:t>
+      </w:r>
+      <w:r>
+        <w:t xml:space="preserve"> </w:t>
+      </w:r>
+      <w:r>
+        <w:rPr>
+          <w:b/>
+          <w:bCs/>
+        </w:rPr>
+        <w:t xml:space="preserve">BOTH</w:t>
+      </w:r>
+      <w:r>
+        <w:t xml:space="preserve"> </w:t>
+      </w:r>
+      <w:r>
+        <w:t xml:space="preserve">files:</w:t>
+      </w:r>
+    </w:p>
+    <w:p>
+      <w:pPr>
+        <w:pStyle w:val="Compact"/>
+        <w:numPr>
+          <w:ilvl w:val="0"/>
+          <w:numId w:val="1006"/>
+        </w:numPr>
+      </w:pPr>
+      <w:r>
+        <w:rPr>
+          <w:rStyle w:val="VerbatimChar"/>
+        </w:rPr>
+        <w:t xml:space="preserve">docs/composition_engine_reference.md</w:t>
+      </w:r>
+    </w:p>
+    <w:p>
+      <w:pPr>
+        <w:pStyle w:val="Compact"/>
+        <w:numPr>
+          <w:ilvl w:val="0"/>
+          <w:numId w:val="1006"/>
+        </w:numPr>
+      </w:pPr>
+      <w:r>
+        <w:rPr>
+          <w:rStyle w:val="VerbatimChar"/>
+        </w:rPr>
+        <w:t xml:space="preserve">docs/composition_engine_reference.docx</w:t>
+      </w:r>
+    </w:p>
+    <w:p>
+      <w:pPr>
+        <w:pStyle w:val="FirstParagraph"/>
+      </w:pPr>
+      <w:r>
+        <w:t xml:space="preserve">Regenerate the</w:t>
+      </w:r>
+      <w:r>
+        <w:t xml:space="preserve"> </w:t>
+      </w:r>
+      <w:r>
+        <w:rPr>
+          <w:rStyle w:val="VerbatimChar"/>
+        </w:rPr>
+        <w:t xml:space="preserve">.docx</w:t>
+      </w:r>
+      <w:r>
+        <w:t xml:space="preserve"> </w:t>
+      </w:r>
+      <w:r>
+        <w:t xml:space="preserve">from the</w:t>
+      </w:r>
+      <w:r>
+        <w:t xml:space="preserve"> </w:t>
+      </w:r>
+      <w:r>
+        <w:rPr>
+          <w:rStyle w:val="VerbatimChar"/>
+        </w:rPr>
+        <w:t xml:space="preserve">.md</w:t>
+      </w:r>
+      <w:r>
+        <w:t xml:space="preserve"> </w:t>
+      </w:r>
+      <w:r>
+        <w:t xml:space="preserve">using pandoc:</w:t>
+      </w:r>
+    </w:p>
+    <w:p>
+      <w:pPr>
+        <w:pStyle w:val="SourceCode"/>
+      </w:pPr>
+      <w:r>
+        <w:rPr>
+          <w:rStyle w:val="ExtensionTok"/>
+        </w:rPr>
+        <w:t xml:space="preserve">pandoc</w:t>
+      </w:r>
+      <w:r>
+        <w:rPr>
+          <w:rStyle w:val="NormalTok"/>
+        </w:rPr>
+        <w:t xml:space="preserve"> docs/composition_engine_reference.md </w:t>
+      </w:r>
+      <w:r>
+        <w:rPr>
+          <w:rStyle w:val="AttributeTok"/>
+        </w:rPr>
+        <w:t xml:space="preserve">-o</w:t>
+      </w:r>
+      <w:r>
+        <w:rPr>
+          <w:rStyle w:val="NormalTok"/>
+        </w:rPr>
+        <w:t xml:space="preserve"> docs/composition_engine_reference.docx</w:t>
+      </w:r>
+    </w:p>
+    <w:p>
+      <w:r>
+        <w:pict>
+          <v:rect style="width:0;height:1.5pt" o:hralign="center" o:hrstd="t" o:hr="t"/>
+        </w:pict>
+      </w:r>
+    </w:p>
+    <w:bookmarkEnd w:id="26"/>
+    <w:bookmarkStart w:id="27" w:name="reference-locations"/>
     <w:p>
       <w:pPr>
         <w:pStyle w:val="Heading2"/>
@@ -2969,6 +4244,60 @@
               <w:pStyle w:val="Compact"/>
             </w:pPr>
             <w:r>
+              <w:t xml:space="preserve">Wheeler Lyric engine</w:t>
+            </w:r>
+          </w:p>
+        </w:tc>
+        <w:tc>
+          <w:tcPr/>
+          <w:p>
+            <w:pPr>
+              <w:pStyle w:val="Compact"/>
+            </w:pPr>
+            <w:r>
+              <w:rPr>
+                <w:rStyle w:val="VerbatimChar"/>
+              </w:rPr>
+              <w:t xml:space="preserve">engines/wheeler_lyric_engine.md</w:t>
+            </w:r>
+          </w:p>
+        </w:tc>
+      </w:tr>
+      <w:tr>
+        <w:tc>
+          <w:tcPr/>
+          <w:p>
+            <w:pPr>
+              <w:pStyle w:val="Compact"/>
+            </w:pPr>
+            <w:r>
+              <w:t xml:space="preserve">Stravinsky Chamber Pulse engine</w:t>
+            </w:r>
+          </w:p>
+        </w:tc>
+        <w:tc>
+          <w:tcPr/>
+          <w:p>
+            <w:pPr>
+              <w:pStyle w:val="Compact"/>
+            </w:pPr>
+            <w:r>
+              <w:rPr>
+                <w:rStyle w:val="VerbatimChar"/>
+              </w:rPr>
+              <w:t xml:space="preserve">engines/stravinsky_chamber_pulse_engine.md</w:t>
+            </w:r>
+          </w:p>
+        </w:tc>
+      </w:tr>
+      <w:tr>
+        <w:tc>
+          <w:tcPr/>
+          <w:p>
+            <w:pPr>
+              <w:pStyle w:val="Compact"/>
+            </w:pPr>
+            <w:r>
               <w:t xml:space="preserve">Score readability standard</w:t>
             </w:r>
           </w:p>
@@ -3050,6 +4379,33 @@
               <w:pStyle w:val="Compact"/>
             </w:pPr>
             <w:r>
+              <w:t xml:space="preserve">Final Pass generation mode</w:t>
+            </w:r>
+          </w:p>
+        </w:tc>
+        <w:tc>
+          <w:tcPr/>
+          <w:p>
+            <w:pPr>
+              <w:pStyle w:val="Compact"/>
+            </w:pPr>
+            <w:r>
+              <w:rPr>
+                <w:rStyle w:val="VerbatimChar"/>
+              </w:rPr>
+              <w:t xml:space="preserve">rules/final-pass-generation-mode.md</w:t>
+            </w:r>
+          </w:p>
+        </w:tc>
+      </w:tr>
+      <w:tr>
+        <w:tc>
+          <w:tcPr/>
+          <w:p>
+            <w:pPr>
+              <w:pStyle w:val="Compact"/>
+            </w:pPr>
+            <w:r>
               <w:t xml:space="preserve">One piece – one folder</w:t>
             </w:r>
           </w:p>
@@ -3089,8 +4445,8 @@
         <w:t xml:space="preserve">This manual is the central rulebook for the composition engine system. Keep it synchronized with all engine and rule changes.</w:t>
       </w:r>
     </w:p>
-    <w:bookmarkEnd w:id="24"/>
-    <w:bookmarkEnd w:id="25"/>
+    <w:bookmarkEnd w:id="27"/>
+    <w:bookmarkEnd w:id="28"/>
     <w:sectPr>
       <w:footnotePr>
         <w:numRestart w:val="eachSect"/>
@@ -3429,6 +4785,39 @@
     <w:abstractNumId w:val="991"/>
   </w:num>
   <w:num w:numId="1004">
+    <w:abstractNumId w:val="991"/>
+  </w:num>
+  <w:num w:numId="1005">
+    <w:abstractNumId w:val="99411"/>
+    <w:lvlOverride w:ilvl="0">
+      <w:startOverride w:val="1"/>
+    </w:lvlOverride>
+    <w:lvlOverride w:ilvl="1">
+      <w:startOverride w:val="1"/>
+    </w:lvlOverride>
+    <w:lvlOverride w:ilvl="2">
+      <w:startOverride w:val="1"/>
+    </w:lvlOverride>
+    <w:lvlOverride w:ilvl="3">
+      <w:startOverride w:val="1"/>
+    </w:lvlOverride>
+    <w:lvlOverride w:ilvl="4">
+      <w:startOverride w:val="1"/>
+    </w:lvlOverride>
+    <w:lvlOverride w:ilvl="5">
+      <w:startOverride w:val="1"/>
+    </w:lvlOverride>
+    <w:lvlOverride w:ilvl="6">
+      <w:startOverride w:val="1"/>
+    </w:lvlOverride>
+    <w:lvlOverride w:ilvl="7">
+      <w:startOverride w:val="1"/>
+    </w:lvlOverride>
+    <w:lvlOverride w:ilvl="8">
+      <w:startOverride w:val="1"/>
+    </w:lvlOverride>
+  </w:num>
+  <w:num w:numId="1006">
     <w:abstractNumId w:val="991"/>
   </w:num>
 </w:numbering>

</xml_diff>